<commit_message>
fix: daily/weekly-report.docx의 표 서식이 실제 Word/Pages에서 깨지던 문제 수정
Co-Authored-By: Claude Sonnet 5 <noreply@anthropic.com>
Claude-Session: https://claude.ai/code/session_01UXnikNkHiAhofwf9QoVMzy
</commit_message>
<xml_diff>
--- a/backend/src/main/resources/demo-templates/daily-report.docx
+++ b/backend/src/main/resources/demo-templates/daily-report.docx
@@ -18,10 +18,10 @@
     </w:p>
     <w:p>
       <w:pPr>
-        <w:spacing w:after="200"/>
         <w:pBdr>
           <w:bottom w:val="single" w:sz="18" w:space="1" w:color="1F3864"/>
         </w:pBdr>
+        <w:spacing w:after="200"/>
       </w:pPr>
     </w:p>
     <w:p>
@@ -53,11 +53,10 @@
     </w:p>
     <w:tbl>
       <w:tblPr>
-        <w:tblW w:type="auto" w:w="0"/>
+        <w:tblW w:type="dxa" w:w="9072"/>
         <w:jc w:val="center"/>
         <w:tblLayout w:type="fixed"/>
         <w:tblLook w:firstColumn="1" w:firstRow="1" w:lastColumn="0" w:lastRow="0" w:noHBand="0" w:noVBand="1" w:val="04A0"/>
-        <w:tblW w:w="9072" w:type="dxa"/>
       </w:tblPr>
       <w:tblGrid>
         <w:gridCol w:w="1134"/>
@@ -70,13 +69,13 @@
         <w:tc>
           <w:tcPr>
             <w:tcW w:type="dxa" w:w="1134"/>
-            <w:shd w:val="clear" w:color="auto" w:fill="1F3864"/>
             <w:tcBorders>
               <w:top w:val="single" w:sz="4" w:space="0" w:color="1F3864"/>
               <w:left w:val="single" w:sz="4" w:space="0" w:color="1F3864"/>
               <w:bottom w:val="single" w:sz="4" w:space="0" w:color="1F3864"/>
               <w:right w:val="single" w:sz="4" w:space="0" w:color="1F3864"/>
             </w:tcBorders>
+            <w:shd w:val="clear" w:color="auto" w:fill="1F3864"/>
           </w:tcPr>
           <w:p>
             <w:pPr>
@@ -97,13 +96,13 @@
         <w:tc>
           <w:tcPr>
             <w:tcW w:type="dxa" w:w="4082"/>
-            <w:shd w:val="clear" w:color="auto" w:fill="1F3864"/>
             <w:tcBorders>
               <w:top w:val="single" w:sz="4" w:space="0" w:color="1F3864"/>
               <w:left w:val="single" w:sz="4" w:space="0" w:color="1F3864"/>
               <w:bottom w:val="single" w:sz="4" w:space="0" w:color="1F3864"/>
               <w:right w:val="single" w:sz="4" w:space="0" w:color="1F3864"/>
             </w:tcBorders>
+            <w:shd w:val="clear" w:color="auto" w:fill="1F3864"/>
           </w:tcPr>
           <w:p>
             <w:pPr>
@@ -124,13 +123,13 @@
         <w:tc>
           <w:tcPr>
             <w:tcW w:type="dxa" w:w="1020"/>
-            <w:shd w:val="clear" w:color="auto" w:fill="1F3864"/>
             <w:tcBorders>
               <w:top w:val="single" w:sz="4" w:space="0" w:color="1F3864"/>
               <w:left w:val="single" w:sz="4" w:space="0" w:color="1F3864"/>
               <w:bottom w:val="single" w:sz="4" w:space="0" w:color="1F3864"/>
               <w:right w:val="single" w:sz="4" w:space="0" w:color="1F3864"/>
             </w:tcBorders>
+            <w:shd w:val="clear" w:color="auto" w:fill="1F3864"/>
           </w:tcPr>
           <w:p>
             <w:pPr>
@@ -151,13 +150,13 @@
         <w:tc>
           <w:tcPr>
             <w:tcW w:type="dxa" w:w="1474"/>
-            <w:shd w:val="clear" w:color="auto" w:fill="1F3864"/>
             <w:tcBorders>
               <w:top w:val="single" w:sz="4" w:space="0" w:color="1F3864"/>
               <w:left w:val="single" w:sz="4" w:space="0" w:color="1F3864"/>
               <w:bottom w:val="single" w:sz="4" w:space="0" w:color="1F3864"/>
               <w:right w:val="single" w:sz="4" w:space="0" w:color="1F3864"/>
             </w:tcBorders>
+            <w:shd w:val="clear" w:color="auto" w:fill="1F3864"/>
           </w:tcPr>
           <w:p>
             <w:pPr>
@@ -178,13 +177,13 @@
         <w:tc>
           <w:tcPr>
             <w:tcW w:type="dxa" w:w="1361"/>
-            <w:shd w:val="clear" w:color="auto" w:fill="1F3864"/>
             <w:tcBorders>
               <w:top w:val="single" w:sz="4" w:space="0" w:color="1F3864"/>
               <w:left w:val="single" w:sz="4" w:space="0" w:color="1F3864"/>
               <w:bottom w:val="single" w:sz="4" w:space="0" w:color="1F3864"/>
               <w:right w:val="single" w:sz="4" w:space="0" w:color="1F3864"/>
             </w:tcBorders>
+            <w:shd w:val="clear" w:color="auto" w:fill="1F3864"/>
           </w:tcPr>
           <w:p>
             <w:pPr>
@@ -827,11 +826,10 @@
     </w:p>
     <w:tbl>
       <w:tblPr>
-        <w:tblW w:type="auto" w:w="0"/>
+        <w:tblW w:type="dxa" w:w="9072"/>
         <w:jc w:val="center"/>
         <w:tblLayout w:type="fixed"/>
         <w:tblLook w:firstColumn="1" w:firstRow="1" w:lastColumn="0" w:lastRow="0" w:noHBand="0" w:noVBand="1" w:val="04A0"/>
-        <w:tblW w:w="9072" w:type="dxa"/>
       </w:tblPr>
       <w:tblGrid>
         <w:gridCol w:w="1134"/>
@@ -844,13 +842,13 @@
         <w:tc>
           <w:tcPr>
             <w:tcW w:type="dxa" w:w="1134"/>
-            <w:shd w:val="clear" w:color="auto" w:fill="1F3864"/>
             <w:tcBorders>
               <w:top w:val="single" w:sz="4" w:space="0" w:color="1F3864"/>
               <w:left w:val="single" w:sz="4" w:space="0" w:color="1F3864"/>
               <w:bottom w:val="single" w:sz="4" w:space="0" w:color="1F3864"/>
               <w:right w:val="single" w:sz="4" w:space="0" w:color="1F3864"/>
             </w:tcBorders>
+            <w:shd w:val="clear" w:color="auto" w:fill="1F3864"/>
           </w:tcPr>
           <w:p>
             <w:pPr>
@@ -871,13 +869,13 @@
         <w:tc>
           <w:tcPr>
             <w:tcW w:type="dxa" w:w="4082"/>
-            <w:shd w:val="clear" w:color="auto" w:fill="1F3864"/>
             <w:tcBorders>
               <w:top w:val="single" w:sz="4" w:space="0" w:color="1F3864"/>
               <w:left w:val="single" w:sz="4" w:space="0" w:color="1F3864"/>
               <w:bottom w:val="single" w:sz="4" w:space="0" w:color="1F3864"/>
               <w:right w:val="single" w:sz="4" w:space="0" w:color="1F3864"/>
             </w:tcBorders>
+            <w:shd w:val="clear" w:color="auto" w:fill="1F3864"/>
           </w:tcPr>
           <w:p>
             <w:pPr>
@@ -898,13 +896,13 @@
         <w:tc>
           <w:tcPr>
             <w:tcW w:type="dxa" w:w="1020"/>
-            <w:shd w:val="clear" w:color="auto" w:fill="1F3864"/>
             <w:tcBorders>
               <w:top w:val="single" w:sz="4" w:space="0" w:color="1F3864"/>
               <w:left w:val="single" w:sz="4" w:space="0" w:color="1F3864"/>
               <w:bottom w:val="single" w:sz="4" w:space="0" w:color="1F3864"/>
               <w:right w:val="single" w:sz="4" w:space="0" w:color="1F3864"/>
             </w:tcBorders>
+            <w:shd w:val="clear" w:color="auto" w:fill="1F3864"/>
           </w:tcPr>
           <w:p>
             <w:pPr>
@@ -925,13 +923,13 @@
         <w:tc>
           <w:tcPr>
             <w:tcW w:type="dxa" w:w="1474"/>
-            <w:shd w:val="clear" w:color="auto" w:fill="1F3864"/>
             <w:tcBorders>
               <w:top w:val="single" w:sz="4" w:space="0" w:color="1F3864"/>
               <w:left w:val="single" w:sz="4" w:space="0" w:color="1F3864"/>
               <w:bottom w:val="single" w:sz="4" w:space="0" w:color="1F3864"/>
               <w:right w:val="single" w:sz="4" w:space="0" w:color="1F3864"/>
             </w:tcBorders>
+            <w:shd w:val="clear" w:color="auto" w:fill="1F3864"/>
           </w:tcPr>
           <w:p>
             <w:pPr>
@@ -952,13 +950,13 @@
         <w:tc>
           <w:tcPr>
             <w:tcW w:type="dxa" w:w="1361"/>
-            <w:shd w:val="clear" w:color="auto" w:fill="1F3864"/>
             <w:tcBorders>
               <w:top w:val="single" w:sz="4" w:space="0" w:color="1F3864"/>
               <w:left w:val="single" w:sz="4" w:space="0" w:color="1F3864"/>
               <w:bottom w:val="single" w:sz="4" w:space="0" w:color="1F3864"/>
               <w:right w:val="single" w:sz="4" w:space="0" w:color="1F3864"/>
             </w:tcBorders>
+            <w:shd w:val="clear" w:color="auto" w:fill="1F3864"/>
           </w:tcPr>
           <w:p>
             <w:pPr>
@@ -1593,10 +1591,10 @@
     </w:p>
     <w:p>
       <w:pPr>
-        <w:spacing w:after="120"/>
         <w:pBdr>
           <w:bottom w:val="single" w:sz="8" w:space="1" w:color="999999"/>
         </w:pBdr>
+        <w:spacing w:after="120"/>
       </w:pPr>
     </w:p>
     <w:p>

</xml_diff>